<commit_message>
Edit phase 1 materials as a student report
</commit_message>
<xml_diff>
--- a/Фаза 1 - Выбор концепции проекта/Данные и расчёты/Фаза 1 Выбор концепции проекта.docx
+++ b/Фаза 1 - Выбор концепции проекта/Данные и расчёты/Фаза 1 Выбор концепции проекта.docx
@@ -12,7 +12,7 @@
     </w:p>
     <w:p>
       <w:r>
-        <w:t>Четыре концепции оценены нечётким коллективным TOPSIS и чётким коллективным МАИ. В демонстрационном расчёте оба метода рекомендуют сервис регистрации на студенческие события.</w:t>
+        <w:t>Четыре концепции сопоставлены методами нечёткого коллективного TOPSIS и чёткого коллективного МАИ. По обоим методам первое место занял сервис регистрации на студенческие события.</w:t>
       </w:r>
     </w:p>
     <w:p>
@@ -20,7 +20,7 @@
         <w:pStyle w:val="Small"/>
       </w:pPr>
       <w:r>
-        <w:t>Статус на 27 октября 2026 года: все оценки созданы как четыре модельных профиля M1–M4. Они показывают порядок выбора, но не являются личными ответами участников. Учёт задач в YouGile ведётся отдельно.</w:t>
+        <w:t>Расчёт основан на четырёх сценарных профилях M1–M4. Эти оценки заданы без индивидуального опроса участников команды. Учёт работ вынесен на отдельную доску YouGile.</w:t>
       </w:r>
     </w:p>
     <w:p>
@@ -819,12 +819,12 @@
     </w:p>
     <w:p>
       <w:r>
-        <w:t>Для МАИ отдельно заданы профили предпочтений, из которых построены парные сравнения по шкале Саати 1–9 и обратным значениям. Это воспроизводимый сценарий, а не опрос. Исходные числа и все промежуточные расчёты приведены на листах книги «Фаза 1 Экспертные оценки.xlsx».</w:t>
+        <w:t>Для МАИ отдельно заданы профили предпочтений, из которых построены парные сравнения по шкале Саати 1–9 и обратным значениям. Исходные числа и все промежуточные расчёты приведены на листах книги «Фаза 1 Экспертные оценки.xlsx».</w:t>
       </w:r>
     </w:p>
     <w:p>
       <w:r>
-        <w:t>В исходном задании указана группа из трёх человек; реальный состав из четырёх нужно согласовать с преподавателем. Для окончательного командного решения модельные числа следует заменить личными оценками участников.</w:t>
+        <w:t>Фактический состав команды — четыре человека. В исходном тексте задания указана группа из трёх человек.</w:t>
       </w:r>
     </w:p>
     <w:p>
@@ -868,7 +868,7 @@
     </w:p>
     <w:p>
       <w:r>
-        <w:t>Для каждой матрицы проверяется согласованность: λmax = среднее (Aw)i/wi, CI = (λmax−4)/3, CR = CI/0,90. Если CR превышает 0,10, команда пересматривает противоречивые сравнения и фиксирует исправления. Максимальный общий приоритет определяет выбор по МАИ.</w:t>
+        <w:t>Для каждой матрицы вычислена согласованность: λmax = среднее (Aw)i/wi, CI = (λmax−4)/3, CR = CI/0,90. Во всех пяти групповых матрицах CR меньше порогового значения 0,10. Максимальный общий приоритет определяет первое место по МАИ.</w:t>
       </w:r>
     </w:p>
     <w:p>
@@ -881,7 +881,7 @@
         <w:pStyle w:val="Heading1"/>
       </w:pPr>
       <w:r>
-        <w:t>5 Результаты и решение команды</w:t>
+        <w:t>5 Результаты сравнения</w:t>
       </w:r>
     </w:p>
     <w:tbl>
@@ -1497,7 +1497,7 @@
     <w:p/>
     <w:p>
       <w:r>
-        <w:t>Лидер модельного расчёта — A3 «Регистрация на студенческие события». TOPSIS: CC = 0,8228; МАИ: приоритет = 0,3012. В обоих методах далее следуют A4, A2 и A1. У A3 высокий баланс по четырём критериям; A2 сильнее по реализуемости, A4 — по пригодности для планирования.</w:t>
+        <w:t>По обоим методам первое место заняла A3 «Регистрация на студенческие события». TOPSIS: CC = 0,8228; МАИ: приоритет = 0,3012. Далее следуют A4, A2 и A1. У A3 высокий баланс по четырём критериям; A2 сильнее по реализуемости, A4 — по пригодности для планирования.</w:t>
       </w:r>
     </w:p>
     <w:p>
@@ -1507,7 +1507,7 @@
     </w:p>
     <w:p>
       <w:r>
-        <w:t>Вывод ограничен выбранными модельными оценками. Реальное решение команды требует независимых ответов участников; при их изменении расчёт следует повторить. Коэффициенты TOPSIS и приоритеты МАИ имеют разные шкалы и сравниваются по порядку альтернатив, а не по величине.</w:t>
+        <w:t>Полученный порядок относится к заданным сценарным оценкам. Коэффициенты TOPSIS и приоритеты МАИ имеют разные шкалы и сопоставляются по порядку альтернатив, а не по абсолютной величине.</w:t>
       </w:r>
     </w:p>
     <w:p>
@@ -1520,7 +1520,7 @@
     </w:p>
     <w:p>
       <w:r>
-        <w:t>Задачи, исполнители, периоды и чистое время работы ведутся в отдельном проекте YouGile, за который отвечает напарник. Доска: https://ru.yougile.com/board/nb0783gl8x30. В этом репозитории папка таск-трекера не создаётся. Перед сдачей следует проверить доступ преподавателя к доске.</w:t>
+        <w:t>Учёт задач, исполнителей, периодов и чистого времени работы вынесен на отдельную доску YouGile: https://ru.yougile.com/board/nb0783gl8x30. Материалы таск-трекера в данном репозитории не дублируются.</w:t>
       </w:r>
     </w:p>
     <w:p>
@@ -1569,7 +1569,7 @@
       <w:rPr>
         <w:sz w:val="16"/>
       </w:rPr>
-      <w:t>Фаза 1 • Рабочий материал</w:t>
+      <w:t>Фаза 1 • Отчёт</w:t>
     </w:r>
   </w:p>
 </w:ftr>

</xml_diff>